<commit_message>
docs: author name and live web links in Word deliverables
Links in the documents are now real hyperlinks.
</commit_message>
<xml_diff>
--- a/docs/word/Artikel-Jurnal-LabTrack.docx
+++ b/docs/word/Artikel-Jurnal-LabTrack.docx
@@ -25,7 +25,7 @@
         <w:rPr>
           <w:sz w:val="21"/>
         </w:rPr>
-        <w:t>[Nama lengkap peserta]</w:t>
+        <w:t>Muhammad Abrar Rayhan</w:t>
       </w:r>
     </w:p>
     <w:p>
@@ -57,12 +57,32 @@
         <w:spacing w:after="0"/>
         <w:jc w:val="center"/>
       </w:pPr>
-      <w:r>
-        <w:rPr>
-          <w:sz w:val="21"/>
-        </w:rPr>
-        <w:t>github.com/Muhammadabrarrayhan2/labtrack</w:t>
-      </w:r>
+      <w:hyperlink r:id="rId9">
+        <w:r>
+          <w:rPr>
+            <w:color w:val="0D4F5C"/>
+            <w:u w:val="single"/>
+            <w:sz w:val="21"/>
+          </w:rPr>
+          <w:t>https://github.com/Muhammadabrarrayhan2/labtrack</w:t>
+        </w:r>
+      </w:hyperlink>
+    </w:p>
+    <w:p>
+      <w:pPr>
+        <w:spacing w:after="0"/>
+        <w:jc w:val="center"/>
+      </w:pPr>
+      <w:hyperlink r:id="rId10">
+        <w:r>
+          <w:rPr>
+            <w:color w:val="0D4F5C"/>
+            <w:u w:val="single"/>
+            <w:sz w:val="21"/>
+          </w:rPr>
+          <w:t>https://labtrack-api-b26757zszq-et.a.run.app/app/</w:t>
+        </w:r>
+      </w:hyperlink>
     </w:p>
     <w:p>
       <w:pPr>
@@ -387,7 +407,7 @@
                     <pic:cNvPicPr/>
                   </pic:nvPicPr>
                   <pic:blipFill>
-                    <a:blip r:embed="rId9"/>
+                    <a:blip r:embed="rId11"/>
                     <a:stretch>
                       <a:fillRect/>
                     </a:stretch>
@@ -1589,7 +1609,7 @@
                     <pic:cNvPicPr/>
                   </pic:nvPicPr>
                   <pic:blipFill>
-                    <a:blip r:embed="rId10"/>
+                    <a:blip r:embed="rId12"/>
                     <a:stretch>
                       <a:fillRect/>
                     </a:stretch>
@@ -1675,7 +1695,7 @@
                     <pic:cNvPicPr/>
                   </pic:nvPicPr>
                   <pic:blipFill>
-                    <a:blip r:embed="rId11"/>
+                    <a:blip r:embed="rId13"/>
                     <a:stretch>
                       <a:fillRect/>
                     </a:stretch>
@@ -1769,7 +1789,7 @@
                     <pic:cNvPicPr/>
                   </pic:nvPicPr>
                   <pic:blipFill>
-                    <a:blip r:embed="rId12"/>
+                    <a:blip r:embed="rId14"/>
                     <a:stretch>
                       <a:fillRect/>
                     </a:stretch>
@@ -2415,8 +2435,8 @@
       </w:r>
     </w:p>
     <w:sectPr>
-      <w:headerReference w:type="default" r:id="rId13"/>
-      <w:footerReference w:type="default" r:id="rId14"/>
+      <w:headerReference w:type="default" r:id="rId15"/>
+      <w:footerReference w:type="default" r:id="rId16"/>
       <w:pgSz w:w="11906" w:h="16838"/>
       <w:pgMar w:top="1417" w:right="1417" w:bottom="1417" w:left="1701" w:header="720" w:footer="720" w:gutter="0"/>
       <w:cols w:space="720"/>

</xml_diff>